<commit_message>
Added Design doc and changed project name in SupplReq. To be more coherent with rest of the documents.
</commit_message>
<xml_diff>
--- a/SG3_Devices/SG3_Artifacts/SG3_SupplReqs.docx
+++ b/SG3_Devices/SG3_Artifacts/SG3_SupplReqs.docx
@@ -16,7 +16,10 @@
         <w:pStyle w:val="Rubrik1"/>
       </w:pPr>
       <w:r>
-        <w:t>Smart home Devices</w:t>
+        <w:t>Interactive House Project</w:t>
+      </w:r>
+      <w:r>
+        <w:t xml:space="preserve"> (Device Subgroup)</w:t>
       </w:r>
     </w:p>
     <w:p/>
@@ -1188,16 +1191,7 @@
         <w:spacing w:line="360" w:lineRule="auto"/>
       </w:pPr>
       <w:r>
-        <w:t>S</w:t>
-      </w:r>
-      <w:r>
-        <w:t>5</w:t>
-      </w:r>
-      <w:r>
-        <w:t xml:space="preserve">. </w:t>
-      </w:r>
-      <w:r>
-        <w:t>Fault Handling – Communication Robustness</w:t>
+        <w:t>S5. Fault Handling – Communication Robustness</w:t>
       </w:r>
     </w:p>
     <w:p>

</xml_diff>